<commit_message>
Site updated: 2022-02-25 18:18:45
</commit_message>
<xml_diff>
--- a/treasure/download/经藏/大集部-28部/新建文件夹/大乘大集地藏十轮经-唐-玄奘.docx
+++ b/treasure/download/经藏/大集部-28部/新建文件夹/大乘大集地藏十轮经-唐-玄奘.docx
@@ -39,12 +39,25 @@
     <w:p>
       <w:pPr>
         <w:pStyle w:val="a7"/>
-      </w:pPr>
-      <w:r>
-        <w:rPr>
-          <w:rFonts w:hint="eastAsia"/>
-        </w:rPr>
-        <w:t xml:space="preserve">　　昔者旭照高山，天宫御一乘之驾。流晖原隰，鹿苑转四谛之轮。虽复发轸分逵，而涂无乱辙。一云普洽，而卉木各茂。自鹄林变色。慧日寝光。达学电谢以息肩，真人长往而寂虑。且前贤述圣。难令各解。后进孤陋。更异亲承。况乎正法既往。久当像末。定慧与福德异时，醇化与浇风殊运。然则一乘三乘之驾。安可以同其辙哉。若识时来在数药性勿违。然后可以清沉痼之宿疾，体权实之同归矣。十轮经者。则此土末法之教也。何以明之。佛以末法恶时，去圣浸远。败根比之坏器，空见借喻生盲。沉醉五欲，类石田之不苗。放肆十恶，似臭身之垢秽。故此经能濯臭身，开盲目，陶坏器，沃石田。是以菩萨示声闻之形，象王敬出家之服。以此幢相化彼无惭。显二事之护持，成三乘之道果。故经曰。为令此土三宝种姓威德炽盛久住世故。又曰。摧灭一切诸众生类犹如金刚坚固烦恼。然则三宝久住。显教传于末法。金刚烦恼验障异乎一乘。寻旧经之来。年代盖久。但谱第遗目。传人失记。翻译之主既往，来兹之日罕闻。同我者失魄于真彩，异我者大笑于淡味。谬以千里。能勿悲乎。夫极曜文天。或蔽亏于薄雾。至言轨物。时沦滞于广辩。针石一违，有死生之巨痛。纤毫错学，有升坠之异涂。其可易乎。属有三藏玄奘法师者。始则学架东朝。末乃访道西域。轻一生之性命，涉数万之艰难。果能竭溟渤以索亡珠，蹈龙宫而穷秘藏。吞法流于智海，瓶写无遗。受道气于檀林，香风更馥。至于因明三量声论八音。莫不究立破之源，穷字转之本。如来所说菩萨所传。已来未来一朝备集。昉以薄业不偶真应。幸达圣制乱于未肇。后贤传灯于既夕。遂使定死余命，冀反魂于法药。昏野迷方，期还辕于觉道。于是染翰操纸。杜绝外虑。务详至教。释彼纷执。畴咨法主。重启梵文。粤以永徽二年岁次辛亥正月乙未。尽其年十二月甲寅翻译始毕。凡八品十卷。以今所翻比诸旧本。旧本已有今更详明。旧本所无斯文具载。于是处座伉谈者，响法雷而吐辩。静虑通微者，镜玄波而照心。顶火暴腹之徒，戢萤晖于慧日。喜足谦怀之侣，腾高节于清风矣。前佛既往。后佛未兴。庶此教长悬。永济来者。弘道之士如何勿思。</w:t>
+        <w:ind w:firstLine="480"/>
+      </w:pPr>
+      <w:r>
+        <w:rPr>
+          <w:rFonts w:hint="eastAsia"/>
+        </w:rPr>
+        <w:t>昔者旭照高山，天宫御一乘之驾。流晖原隰，鹿苑转四谛之轮。虽复发轸分逵，而涂无乱辙。一云普洽，而卉木各茂。自鹄林变色。慧日寝光。达学电谢以息肩，真人长往而寂虑。且前贤述圣。难令各解。后进孤陋。更异亲承。况乎正法既往。久当像末。定慧与福德异时，醇化与浇风殊运。然则一乘三乘之驾。安可以同其辙哉。若识时来在数药性勿违。然后可以清沉痼之宿疾，体权实之同归矣。十轮经者。则此土末法之教也。何以明之。佛以末法恶时，去圣浸远。败根比之坏器，空见借喻生盲。沉醉五欲，类石田之不苗。放肆十恶，似臭身之垢秽。故此经能濯臭身，开盲目，陶坏器，沃石田。是以菩萨示声闻之形，象王敬出家之服。以此幢相化彼无惭。显二事之护持，成三乘之道果。故经曰。为令此土三宝种姓威德炽盛久住世故。又曰。摧灭一切诸众生类犹如金刚坚固烦恼。然则三宝久住。显教传于末法。金刚烦恼验障异乎一乘。寻旧经之来。年代盖久。但谱第遗目。传人失记。翻译之主既往，来兹之日罕闻。同我者失魄于真彩，异我者大笑于淡味。谬以千里。能勿悲乎。夫极曜文天。或蔽亏于薄雾。至言轨物。时沦滞于广辩。针石一违，有死生之巨痛。纤毫错学，有升坠之异涂。其可易乎。</w:t>
+      </w:r>
+    </w:p>
+    <w:p>
+      <w:pPr>
+        <w:pStyle w:val="a7"/>
+        <w:ind w:firstLine="480"/>
+      </w:pPr>
+      <w:r>
+        <w:rPr>
+          <w:rFonts w:hint="eastAsia"/>
+        </w:rPr>
+        <w:t>属有三藏玄奘法师者。始则学架东朝。末乃访道西域。轻一生之性命，涉数万之艰难。果能竭溟渤以索亡珠，蹈龙宫而穷秘藏。吞法流于智海，瓶写无遗。受道气于檀林，香风更馥。至于因明三量声论八音。莫不究立破之源，穷字转之本。如来所说菩萨所传。已来未来一朝备集。昉以薄业不偶真应。幸达圣制乱于未肇。后贤传灯于既夕。遂使定死余命，冀反魂于法药。昏野迷方，期还辕于觉道。于是染翰操纸。杜绝外虑。务详至教。释彼纷执。畴咨法主。重启梵文。粤以永徽二年岁次辛亥正月乙未。尽其年十二月甲寅翻译始毕。凡八品十卷。以今所翻比诸旧本。旧本已有今更详明。旧本所无斯文具载。于是处座伉谈者，响法雷而吐辩。静虑通微者，镜玄波而照心。顶火暴腹之徒，戢萤晖于慧日。喜足谦怀之侣，腾高节于清风矣。前佛既往。后佛未兴。庶此教长悬。永济来者。弘道之士如何勿思。</w:t>
       </w:r>
     </w:p>
     <w:p>
@@ -1037,7 +1050,7 @@
         <w:rPr>
           <w:rFonts w:hint="eastAsia"/>
         </w:rPr>
-        <w:t>。由此定力令彼佛土所有一切小轮围山大轮围山、苏迷卢山及诸余山、</w:t>
+        <w:t>。由此定力令彼佛土所有一切小轮围山大轮围山、苏迷卢山及诸余山</w:t>
       </w:r>
       <w:r>
         <w:rPr>
@@ -2091,8 +2104,6 @@
         </w:rPr>
         <w:t>、</w:t>
       </w:r>
-      <w:bookmarkStart w:id="0" w:name="_GoBack"/>
-      <w:bookmarkEnd w:id="0"/>
       <w:r>
         <w:rPr>
           <w:rFonts w:hint="eastAsia"/>
@@ -13237,7 +13248,21 @@
         <w:rPr>
           <w:rFonts w:hint="eastAsia"/>
         </w:rPr>
-        <w:t>大乘大集地藏十轮经卷第十</w:t>
+        <w:t>大乘大集</w:t>
+      </w:r>
+      <w:bookmarkStart w:id="0" w:name="_GoBack"/>
+      <w:r>
+        <w:rPr>
+          <w:rFonts w:hint="eastAsia"/>
+        </w:rPr>
+        <w:t>地藏</w:t>
+      </w:r>
+      <w:bookmarkEnd w:id="0"/>
+      <w:r>
+        <w:rPr>
+          <w:rFonts w:hint="eastAsia"/>
+        </w:rPr>
+        <w:t>十轮经卷第十</w:t>
       </w:r>
     </w:p>
     <w:sectPr>
@@ -14069,7 +14094,7 @@
 </file>
 
 <file path=customXml/itemProps1.xml><?xml version="1.0" encoding="utf-8"?>
-<ds:datastoreItem xmlns:ds="http://schemas.openxmlformats.org/officeDocument/2006/customXml" ds:itemID="{301ADF75-3E2E-4B04-8AE1-A67BFC3C476E}">
+<ds:datastoreItem xmlns:ds="http://schemas.openxmlformats.org/officeDocument/2006/customXml" ds:itemID="{C19DF5A1-8117-44E3-A02E-BB96305849A8}">
   <ds:schemaRefs>
     <ds:schemaRef ds:uri="http://schemas.openxmlformats.org/officeDocument/2006/bibliography"/>
   </ds:schemaRefs>

</xml_diff>